<commit_message>
template diseño generaluno solo
</commit_message>
<xml_diff>
--- a/dist/docs/TemplateDisenoGeneral.docx
+++ b/dist/docs/TemplateDisenoGeneral.docx
@@ -65,20 +65,20 @@
       <w:r>
         <w:rPr>
           <w:b/>
-          <w:sz w:val="22"/>
-          <w:szCs w:val="22"/>
+          <w:sz w:val="20"/>
+          <w:szCs w:val="20"/>
           <w:color w:val="2E75B6"/>
           <w:rFonts w:ascii="Calibri" w:hAnsi="Calibri"/>
         </w:rPr>
-        <w:t xml:space="preserve">Vulnerabilidad: </w:t>
+        <w:t xml:space="preserve">Fecha de Generación: </w:t>
       </w:r>
       <w:r>
         <w:rPr>
-          <w:sz w:val="22"/>
-          <w:szCs w:val="22"/>
+          <w:sz w:val="20"/>
+          <w:szCs w:val="20"/>
           <w:rFonts w:ascii="Calibri" w:hAnsi="Calibri"/>
         </w:rPr>
-        <w:t>{VULN_TYPE}</w:t>
+        <w:t>{FECHA}</w:t>
       </w:r>
     </w:p>
     <w:p>
@@ -94,7 +94,7 @@
           <w:color w:val="2E75B6"/>
           <w:rFonts w:ascii="Calibri" w:hAnsi="Calibri"/>
         </w:rPr>
-        <w:t xml:space="preserve">Fecha de Generación: </w:t>
+        <w:t xml:space="preserve">Total de Vulnerabilidades: </w:t>
       </w:r>
       <w:r>
         <w:rPr>
@@ -102,7 +102,7 @@
           <w:szCs w:val="20"/>
           <w:rFonts w:ascii="Calibri" w:hAnsi="Calibri"/>
         </w:rPr>
-        <w:t>{FECHA}</w:t>
+        <w:t>{TOTAL_VULNS}</w:t>
       </w:r>
     </w:p>
     <w:p>
@@ -123,7 +123,7 @@
     </w:p>
     <w:p>
       <w:pPr>
-        <w:spacing w:before="200" w:after="120"/>
+        <w:spacing w:before="0" w:after="200"/>
       </w:pPr>
       <w:r>
         <w:rPr>
@@ -137,83 +137,8 @@
       </w:r>
     </w:p>
     <w:p>
-      <w:pPr>
-        <w:spacing w:before="200" w:after="80"/>
-      </w:pPr>
       <w:r>
-        <w:rPr>
-          <w:b/>
-          <w:sz w:val="24"/>
-          <w:szCs w:val="24"/>
-          <w:color w:val="2E75B6"/>
-          <w:rFonts w:ascii="Calibri" w:hAnsi="Calibri"/>
-        </w:rPr>
-        <w:t xml:space="preserve">Impactos de la Vulnerabilidad</w:t>
-      </w:r>
-    </w:p>
-    <w:p>
-      <w:r>
-        <w:t>%%IMPACTOS%%</w:t>
-      </w:r>
-    </w:p>
-    <w:p>
-      <w:pPr>
-        <w:spacing w:before="200" w:after="80"/>
-      </w:pPr>
-      <w:r>
-        <w:rPr>
-          <w:b/>
-          <w:sz w:val="24"/>
-          <w:szCs w:val="24"/>
-          <w:color w:val="2E75B6"/>
-          <w:rFonts w:ascii="Calibri" w:hAnsi="Calibri"/>
-        </w:rPr>
-        <w:t xml:space="preserve">Impactos Asociados a OWASP</w:t>
-      </w:r>
-    </w:p>
-    <w:p>
-      <w:r>
-        <w:t>%%OWASP%%</w:t>
-      </w:r>
-    </w:p>
-    <w:p>
-      <w:pPr>
-        <w:spacing w:before="200" w:after="80"/>
-      </w:pPr>
-      <w:r>
-        <w:rPr>
-          <w:b/>
-          <w:sz w:val="24"/>
-          <w:szCs w:val="24"/>
-          <w:color w:val="2E75B6"/>
-          <w:rFonts w:ascii="Calibri" w:hAnsi="Calibri"/>
-        </w:rPr>
-        <w:t xml:space="preserve">Proceso Actual</w:t>
-      </w:r>
-    </w:p>
-    <w:p>
-      <w:r>
-        <w:t>%%PROCESO%%</w:t>
-      </w:r>
-    </w:p>
-    <w:p>
-      <w:pPr>
-        <w:spacing w:before="200" w:after="80"/>
-      </w:pPr>
-      <w:r>
-        <w:rPr>
-          <w:b/>
-          <w:sz w:val="24"/>
-          <w:szCs w:val="24"/>
-          <w:color w:val="2E75B6"/>
-          <w:rFonts w:ascii="Calibri" w:hAnsi="Calibri"/>
-        </w:rPr>
-        <w:t xml:space="preserve">Propuesta de Solución</w:t>
-      </w:r>
-    </w:p>
-    <w:p>
-      <w:r>
-        <w:t>%%SOLUCION%%</w:t>
+        <w:t>%%VULNERABILIDADES%%</w:t>
       </w:r>
     </w:p>
     <w:sectPr>

</xml_diff>